<commit_message>
Revisión mayor: corrige cifras y afirmaciones y prepara la validación a texto completo
Corrige la nota de la tabla 2 y la comparación de los pases de cribado con la
selección final (28 y 22, no 50 y 44), ajusta la crítica a DigComp a lo que
dice el marco, cambia el título y presenta las tradiciones como vocabulario.
Añade el sorteo de 40 estudios en acceso abierto, la descarga de sus textos,
el manual y las planillas de codificación y el script que calcula el acuerdo y
la precisión de los diccionarios. Los PDF no se suben al repositorio.

Co-Authored-By: Claude Opus 5.5 <noreply@anthropic.com>
Claude-Session: https://claude.ai/code/session_01W48ggkE3iqcgcPHVfB8T9P
</commit_message>
<xml_diff>
--- a/revision-adc/carta-al-editor.docx
+++ b/revision-adc/carta-al-editor.docx
@@ -33,7 +33,7 @@
         <w:t xml:space="preserve">“</w:t>
       </w:r>
       <w:r>
-        <w:t xml:space="preserve">From social media to generative artificial intelligence: A scoping review of critical digital literacy in formal education, 2016–2026</w:t>
+        <w:t xml:space="preserve">Critical digital literacy in formal education, 2016–2026: A scoping review of research growth, objects of critique and the rise of generative artificial intelligence</w:t>
       </w:r>
       <w:r>
         <w:t xml:space="preserve">”</w:t>
@@ -71,7 +71,7 @@
         <w:pStyle w:val="BodyText"/>
       </w:pPr>
       <w:r>
-        <w:t xml:space="preserve">The review also makes a methodological contribution. It shows that, in this field, screening on titles alone would have missed more than a third of the relevant studies, and it describes a reproducible second screening pass based on field-level searches of abstracts and keywords. All data and code are openly available.</w:t>
+        <w:t xml:space="preserve">The review also makes a methodological contribution. It shows that, in this field, neither titles nor field-level searches of abstracts alone reproduce the final selection (titles alone would have missed about a fifth of the included studies), and it describes a reproducible second screening pass based on those searches. All data and code are openly available.</w:t>
       </w:r>
     </w:p>
     <w:p>

</xml_diff>

<commit_message>
Amplía el texto principal a 8817 palabras para el reenvío
La revista devolvió el envío porque el texto principal, sin resumen,
tablas, figuras ni referencias, no llegaba a 8000 palabras. Se añaden una
sección de resultados sobre las tres dimensiones en los textos leídos
completos y tres de discusión (revisiones anteriores, implicaciones para la
práctica y para la investigación), con 9 referencias nuevas. La página de
título lleva el correo institucional y el recuento explícito; la carta
explica el reenvío.

Co-Authored-By: Claude Opus 5.5 <noreply@anthropic.com>
Claude-Session: https://claude.ai/code/session_01W48ggkE3iqcgcPHVfB8T9P
</commit_message>
<xml_diff>
--- a/revision-adc/carta-al-editor.docx
+++ b/revision-adc/carta-al-editor.docx
@@ -56,6 +56,14 @@
       </w:r>
       <w:r>
         <w:t xml:space="preserve">.</w:t>
+      </w:r>
+    </w:p>
+    <w:p>
+      <w:pPr>
+        <w:pStyle w:val="BodyText"/>
+      </w:pPr>
+      <w:r>
+        <w:t xml:space="preserve">This is a resubmission. The editorial office returned the first submission because the main text was below the journal’s guideline of 8,000 words. The main text now has 8,817 words, excluding the abstract, tables, figures and references. The added material is substantive: a results section on how the three dimensions of critical digital literacy appear in the 25 eligible studies read in full, and discussion sections that relate the findings to earlier reviews and set out implications for practice and for research. The findings and conclusions are unchanged.</w:t>
       </w:r>
     </w:p>
     <w:p>

</xml_diff>